<commit_message>
Station map: use canonical CTD_LOG.csv stations; convert log coords to decimal
Resave CTD_LOG.csv with decimal lat/lon, and base the station overlay on it
(canonical names, Platform/name-derived FULL/CTD/SMBOAT types, cast duration
and notes in the hover).

Co-Authored-By: Claude Opus 4.8 (1M context) <noreply@anthropic.com>
</commit_message>
<xml_diff>
--- a/LakeWinnipeg_DataExplorer_Guide.docx
+++ b/LakeWinnipeg_DataExplorer_Guide.docx
@@ -7,7 +7,7 @@
         <w:pStyle w:val="Title"/>
       </w:pPr>
       <w:r>
-        <w:t xml:space="preserve">Lake Winnipeg 2025 — MV NAMAO Data Explorer</w:t>
+        <w:t xml:space="preserve">Lake Winnipeg Field Course — MV NAMAO Data Explorer</w:t>
       </w:r>
     </w:p>
     <w:bookmarkStart w:id="14" w:name="Xd4f1a2f323f5a3f7157316788d053f26c9c7aff"/>
@@ -402,25 +402,28 @@
           <w:b/>
           <w:bCs/>
         </w:rPr>
-        <w:t xml:space="preserve">Sonde stops</w:t>
-      </w:r>
-      <w:r>
-        <w:t xml:space="preserve"> </w:t>
-      </w:r>
-      <w:r>
-        <w:t xml:space="preserve">overlay (from</w:t>
-      </w:r>
-      <w:r>
-        <w:t xml:space="preserve"> </w:t>
-      </w:r>
-      <w:r>
-        <w:rPr>
-          <w:rStyle w:val="VerbatimChar"/>
-        </w:rPr>
-        <w:t xml:space="preserve">sonde_stations.csv</w:t>
-      </w:r>
-      <w:r>
-        <w:t xml:space="preserve">) marks every &gt;5-min stop —</w:t>
+        <w:t xml:space="preserve">Stations</w:t>
+      </w:r>
+      <w:r>
+        <w:t xml:space="preserve"> </w:t>
+      </w:r>
+      <w:r>
+        <w:t xml:space="preserve">overlay (from the canonical</w:t>
+      </w:r>
+      <w:r>
+        <w:t xml:space="preserve"> </w:t>
+      </w:r>
+      <w:r>
+        <w:rPr>
+          <w:rStyle w:val="VerbatimChar"/>
+        </w:rPr>
+        <w:t xml:space="preserve">CTD_LOG.csv</w:t>
+      </w:r>
+      <w:r>
+        <w:t xml:space="preserve"> </w:t>
+      </w:r>
+      <w:r>
+        <w:t xml:space="preserve">cast log) marks every cast — named</w:t>
       </w:r>
       <w:r>
         <w:t xml:space="preserve"> </w:t>
@@ -436,23 +439,39 @@
         <w:t xml:space="preserve"> </w:t>
       </w:r>
       <w:r>
-        <w:t xml:space="preserve">as labelled gold diamonds sized by duration, quick</w:t>
-      </w:r>
-      <w:r>
-        <w:t xml:space="preserve"> </w:t>
-      </w:r>
-      <w:r>
-        <w:rPr>
-          <w:b/>
-          <w:bCs/>
-        </w:rPr>
-        <w:t xml:space="preserve">CTD stops</w:t>
-      </w:r>
-      <w:r>
-        <w:t xml:space="preserve"> </w:t>
-      </w:r>
-      <w:r>
-        <w:t xml:space="preserve">as small dots.</w:t>
+        <w:t xml:space="preserve">as labelled gold diamonds,</w:t>
+      </w:r>
+      <w:r>
+        <w:t xml:space="preserve"> </w:t>
+      </w:r>
+      <w:r>
+        <w:rPr>
+          <w:b/>
+          <w:bCs/>
+        </w:rPr>
+        <w:t xml:space="preserve">CTD</w:t>
+      </w:r>
+      <w:r>
+        <w:t xml:space="preserve"> </w:t>
+      </w:r>
+      <w:r>
+        <w:t xml:space="preserve">transect casts as green dots,</w:t>
+      </w:r>
+      <w:r>
+        <w:t xml:space="preserve"> </w:t>
+      </w:r>
+      <w:r>
+        <w:rPr>
+          <w:b/>
+          <w:bCs/>
+        </w:rPr>
+        <w:t xml:space="preserve">SMBOAT</w:t>
+      </w:r>
+      <w:r>
+        <w:t xml:space="preserve"> </w:t>
+      </w:r>
+      <w:r>
+        <w:t xml:space="preserve">(small-boat) casts as purple triangles; hover for the cast notes.</w:t>
       </w:r>
     </w:p>
     <w:p>

</xml_diff>